<commit_message>
Module 2 assignment upload
</commit_message>
<xml_diff>
--- a/module-1/McCallum_Assignment1.docx
+++ b/module-1/McCallum_Assignment1.docx
@@ -106,8 +106,53 @@
     </w:p>
     <w:p/>
     <w:p>
+      <w:hyperlink r:id="rId6" w:history="1">
+        <w:r>
+          <w:rPr>
+            <w:rStyle w:val="Hyperlink"/>
+          </w:rPr>
+          <w:t>https://github.com/jamare-ai/csd-420</w:t>
+        </w:r>
+      </w:hyperlink>
+    </w:p>
+    <w:p>
       <w:r>
-        <w:t>https://github.com/jamare-ai/csd-420</w:t>
+        <w:lastRenderedPageBreak/>
+        <w:drawing>
+          <wp:inline distT="0" distB="0" distL="0" distR="0" wp14:anchorId="08591A7A" wp14:editId="7843D65F">
+            <wp:extent cx="5943600" cy="3152775"/>
+            <wp:effectExtent l="0" t="0" r="0" b="9525"/>
+            <wp:docPr id="1968718673" name="Picture 1"/>
+            <wp:cNvGraphicFramePr>
+              <a:graphicFrameLocks xmlns:a="http://schemas.openxmlformats.org/drawingml/2006/main" noChangeAspect="1"/>
+            </wp:cNvGraphicFramePr>
+            <a:graphic xmlns:a="http://schemas.openxmlformats.org/drawingml/2006/main">
+              <a:graphicData uri="http://schemas.openxmlformats.org/drawingml/2006/picture">
+                <pic:pic xmlns:pic="http://schemas.openxmlformats.org/drawingml/2006/picture">
+                  <pic:nvPicPr>
+                    <pic:cNvPr id="1968718673" name=""/>
+                    <pic:cNvPicPr/>
+                  </pic:nvPicPr>
+                  <pic:blipFill>
+                    <a:blip r:embed="rId7"/>
+                    <a:stretch>
+                      <a:fillRect/>
+                    </a:stretch>
+                  </pic:blipFill>
+                  <pic:spPr>
+                    <a:xfrm>
+                      <a:off x="0" y="0"/>
+                      <a:ext cx="5943600" cy="3152775"/>
+                    </a:xfrm>
+                    <a:prstGeom prst="rect">
+                      <a:avLst/>
+                    </a:prstGeom>
+                  </pic:spPr>
+                </pic:pic>
+              </a:graphicData>
+            </a:graphic>
+          </wp:inline>
+        </w:drawing>
       </w:r>
     </w:p>
     <w:sectPr>
@@ -1036,6 +1081,29 @@
       <w:spacing w:val="5"/>
     </w:rPr>
   </w:style>
+  <w:style w:type="character" w:styleId="Hyperlink">
+    <w:name w:val="Hyperlink"/>
+    <w:basedOn w:val="DefaultParagraphFont"/>
+    <w:uiPriority w:val="99"/>
+    <w:unhideWhenUsed/>
+    <w:rsid w:val="00AC604E"/>
+    <w:rPr>
+      <w:color w:val="467886" w:themeColor="hyperlink"/>
+      <w:u w:val="single"/>
+    </w:rPr>
+  </w:style>
+  <w:style w:type="character" w:styleId="UnresolvedMention">
+    <w:name w:val="Unresolved Mention"/>
+    <w:basedOn w:val="DefaultParagraphFont"/>
+    <w:uiPriority w:val="99"/>
+    <w:semiHidden/>
+    <w:unhideWhenUsed/>
+    <w:rsid w:val="00AC604E"/>
+    <w:rPr>
+      <w:color w:val="605E5C"/>
+      <w:shd w:val="clear" w:color="auto" w:fill="E1DFDD"/>
+    </w:rPr>
+  </w:style>
 </w:styles>
 </file>
 

</xml_diff>